<commit_message>
Update Chapter 3 methodology with elemental ICAR limits, CQR, and spatial block validation
</commit_message>
<xml_diff>
--- a/Project_Report_Soil_Nutrient_Prediction_50_Pages.docx
+++ b/Project_Report_Soil_Nutrient_Prediction_50_Pages.docx
@@ -11992,22 +11992,7 @@
         <w:jc w:val="center"/>
       </w:pPr>
       <w:r>
-        <w:rPr>
-          <w:rFonts w:ascii="Times New Roman" w:hAnsi="Times New Roman"/>
-          <w:b/>
-          <w:i/>
-          <w:sz w:val="24"/>
-        </w:rPr>
-        <w:t>BSI_div_NDVI = BSI / (NDVI + 0.001)</w:t>
-      </w:r>
-      <w:r>
-        <w:rPr>
-          <w:rFonts w:ascii="Times New Roman" w:hAnsi="Times New Roman"/>
-          <w:b w:val="0"/>
-          <w:i w:val="0"/>
-          <w:sz w:val="22"/>
-        </w:rPr>
-        <w:t xml:space="preserve">    ... (3.14)</w:t>
+        <w:t>BSI_div_NDVI = BSI / (|NDVI| + 0.05)    ... (3.14)</w:t>
       </w:r>
     </w:p>
     <w:p>
@@ -13611,18 +13596,10 @@
             </w:tcMar>
           </w:tcPr>
           <w:p>
-            <w:pPr>
-              <w:spacing w:before="0" w:after="0"/>
-              <w:jc w:val="left"/>
-            </w:pPr>
-            <w:r/>
-            <w:r>
-              <w:rPr>
-                <w:rFonts w:ascii="Times New Roman" w:hAnsi="Times New Roman"/>
-                <w:color w:val="222222"/>
-                <w:sz w:val="20"/>
-              </w:rPr>
-              <w:t>&lt; 23 kg/ha (Olsen)</w:t>
+            <w:r>
+              <w:t>&lt; 10 kg/ha</w:t>
+              <w:br/>
+              <w:t>(equiv. &lt; 23 kg/ha P2O5)</w:t>
             </w:r>
           </w:p>
         </w:tc>
@@ -13638,18 +13615,10 @@
             </w:tcMar>
           </w:tcPr>
           <w:p>
-            <w:pPr>
-              <w:spacing w:before="0" w:after="0"/>
-              <w:jc w:val="center"/>
-            </w:pPr>
-            <w:r/>
-            <w:r>
-              <w:rPr>
-                <w:rFonts w:ascii="Times New Roman" w:hAnsi="Times New Roman"/>
-                <w:color w:val="222222"/>
-                <w:sz w:val="20"/>
-              </w:rPr>
-              <w:t>23 - 56 kg/ha</w:t>
+            <w:r>
+              <w:t>10 - 25 kg/ha</w:t>
+              <w:br/>
+              <w:t>(equiv. 23 - 56 kg/ha P2O5)</w:t>
             </w:r>
           </w:p>
         </w:tc>
@@ -13665,18 +13634,10 @@
             </w:tcMar>
           </w:tcPr>
           <w:p>
-            <w:pPr>
-              <w:spacing w:before="0" w:after="0"/>
-              <w:jc w:val="center"/>
-            </w:pPr>
-            <w:r/>
-            <w:r>
-              <w:rPr>
-                <w:rFonts w:ascii="Times New Roman" w:hAnsi="Times New Roman"/>
-                <w:color w:val="222222"/>
-                <w:sz w:val="20"/>
-              </w:rPr>
-              <w:t>&gt; 56 kg/ha</w:t>
+            <w:r>
+              <w:t>&gt; 25 kg/ha</w:t>
+              <w:br/>
+              <w:t>(equiv. &gt; 56 kg/ha P2O5)</w:t>
             </w:r>
           </w:p>
         </w:tc>
@@ -13692,18 +13653,8 @@
             </w:tcMar>
           </w:tcPr>
           <w:p>
-            <w:pPr>
-              <w:spacing w:before="0" w:after="0"/>
-              <w:jc w:val="left"/>
-            </w:pPr>
-            <w:r/>
-            <w:r>
-              <w:rPr>
-                <w:rFonts w:ascii="Times New Roman" w:hAnsi="Times New Roman"/>
-                <w:color w:val="222222"/>
-                <w:sz w:val="20"/>
-              </w:rPr>
-              <w:t>ICAR Soil Health Card Standard</w:t>
+            <w:r>
+              <w:t>Olsen 0.5M NaHCO3 / ICAR Standard</w:t>
             </w:r>
           </w:p>
         </w:tc>
@@ -13748,18 +13699,10 @@
             </w:tcMar>
           </w:tcPr>
           <w:p>
-            <w:pPr>
-              <w:spacing w:before="0" w:after="0"/>
-              <w:jc w:val="center"/>
-            </w:pPr>
-            <w:r/>
-            <w:r>
-              <w:rPr>
-                <w:rFonts w:ascii="Times New Roman" w:hAnsi="Times New Roman"/>
-                <w:color w:val="222222"/>
-                <w:sz w:val="20"/>
-              </w:rPr>
-              <w:t>&lt; 145 kg/ha</w:t>
+            <w:r>
+              <w:t>&lt; 140 kg/ha</w:t>
+              <w:br/>
+              <w:t>(equiv. &lt; 168 kg/ha K2O)</w:t>
             </w:r>
           </w:p>
         </w:tc>
@@ -13775,18 +13718,10 @@
             </w:tcMar>
           </w:tcPr>
           <w:p>
-            <w:pPr>
-              <w:spacing w:before="0" w:after="0"/>
-              <w:jc w:val="center"/>
-            </w:pPr>
-            <w:r/>
-            <w:r>
-              <w:rPr>
-                <w:rFonts w:ascii="Times New Roman" w:hAnsi="Times New Roman"/>
-                <w:color w:val="222222"/>
-                <w:sz w:val="20"/>
-              </w:rPr>
-              <w:t>145 - 337 kg/ha</w:t>
+            <w:r>
+              <w:t>140 - 280 kg/ha</w:t>
+              <w:br/>
+              <w:t>(equiv. 168 - 337 kg/ha K2O)</w:t>
             </w:r>
           </w:p>
         </w:tc>
@@ -13802,18 +13737,10 @@
             </w:tcMar>
           </w:tcPr>
           <w:p>
-            <w:pPr>
-              <w:spacing w:before="0" w:after="0"/>
-              <w:jc w:val="center"/>
-            </w:pPr>
-            <w:r/>
-            <w:r>
-              <w:rPr>
-                <w:rFonts w:ascii="Times New Roman" w:hAnsi="Times New Roman"/>
-                <w:color w:val="222222"/>
-                <w:sz w:val="20"/>
-              </w:rPr>
-              <w:t>&gt; 337 kg/ha</w:t>
+            <w:r>
+              <w:t>&gt; 280 kg/ha</w:t>
+              <w:br/>
+              <w:t>(equiv. &gt; 337 kg/ha K2O)</w:t>
             </w:r>
           </w:p>
         </w:tc>
@@ -13829,18 +13756,8 @@
             </w:tcMar>
           </w:tcPr>
           <w:p>
-            <w:pPr>
-              <w:spacing w:before="0" w:after="0"/>
-              <w:jc w:val="left"/>
-            </w:pPr>
-            <w:r/>
-            <w:r>
-              <w:rPr>
-                <w:rFonts w:ascii="Times New Roman" w:hAnsi="Times New Roman"/>
-                <w:color w:val="222222"/>
-                <w:sz w:val="20"/>
-              </w:rPr>
-              <w:t>ICAR Soil Health Card Standard</w:t>
+            <w:r>
+              <w:t>Neutral 1N NH4OAc / ICAR Standard</w:t>
             </w:r>
           </w:p>
         </w:tc>

</xml_diff>